<commit_message>
docs: sisipkan bukti pengujian Vercel dan lokal ke laporan
</commit_message>
<xml_diff>
--- a/Laporan_Tugas1_2428240069_M Rizki Algipari.docx
+++ b/Laporan_Tugas1_2428240069_M Rizki Algipari.docx
@@ -4663,7 +4663,7 @@
         <w:spacing w:after="100"/>
       </w:pPr>
       <w:r>
-        <w:t xml:space="preserve">Server dijalankan dengan npm run dev. Pengujian dilakukan di Postman atau ekstensi Thunder Client pada VS Code terhadap alamat http://localhost:3000, meliputi seluruh method (GET, POST, PUT, DELETE), pengiriman body JSON, serta pengujian kasus gagal seperti id yang tidak ada dan field wajib yang kosong. Hasil pengujian dicatat pada Tabel 1 bagian V.</w:t>
+        <w:t xml:space="preserve">Server dijalankan dengan npm run dev. Pengujian dilakukan memakai curl pada terminal Git Bash terhadap dua alamat: server lokal http://localhost:3000 dan hasil deployment https://tugas1-restful-2428240069.vercel.app. Setiap request dikirim dengan opsi -i agar baris status dan header respons ikut terlihat, meliputi seluruh method (GET, POST, PUT, DELETE), pengiriman body JSON dengan header Content-Type: application/json, serta pengujian kasus gagal seperti id yang tidak ada dan field wajib yang kosong. Hasil pengujian dicatat pada Tabel 1 bagian V.</w:t>
       </w:r>
     </w:p>
     <w:p>
@@ -4799,6 +4799,14 @@
           <w:szCs w:val="18"/>
         </w:rPr>
         <w:t xml:space="preserve">DELETE http://localhost:3000/paintings/1</w:t>
+      </w:r>
+    </w:p>
+    <w:p>
+      <w:pPr>
+        <w:spacing w:after="100"/>
+      </w:pPr>
+      <w:r>
+        <w:t xml:space="preserve">Pengujian yang sama diulang terhadap https://tugas1-restful-2428240069.vercel.app untuk membuktikan API berjalan pada lingkungan serverless Vercel.</w:t>
       </w:r>
     </w:p>
     <w:p>
@@ -4834,7 +4842,7 @@
           <w:sz w:val="21"/>
           <w:szCs w:val="21"/>
         </w:rPr>
-        <w:t xml:space="preserve">Tabel 1. Hasil pengujian endpoint API</w:t>
+        <w:t xml:space="preserve">Tabel 1. Hasil pengujian endpoint API pada deployment Vercel</w:t>
       </w:r>
     </w:p>
     <w:tbl>
@@ -6938,7 +6946,7 @@
         <w:spacing w:after="160"/>
       </w:pPr>
       <w:r>
-        <w:t xml:space="preserve">Tabel 1 merangkum sebelas skenario pengujian terhadap enam endpoint. Seluruh skenario menghasilkan status code yang sama dengan yang diharapkan, termasuk kasus gagal berupa data yang tidak lengkap (400) serta id maupun endpoint yang tidak ditemukan (404). Pengujian dijalankan pada Node.js v24.21.0 dengan Express.js 4.22.3 melalui server lokal http://localhost:3000.</w:t>
+        <w:t xml:space="preserve">Tabel 1 merangkum sebelas skenario pengujian terhadap enam endpoint. Seluruh skenario menghasilkan status code yang sama dengan yang diharapkan, termasuk kasus gagal berupa data yang tidak lengkap (400) serta id maupun endpoint yang tidak ditemukan (404). Pengujian dijalankan pada Node.js v24.21.0 dengan Express.js 4.22.3 melalui server lokal http://localhost:3000, lalu diulang pada hasil deployment https://tugas1-restful-2428240069.vercel.app dan memberikan hasil yang sama.</w:t>
       </w:r>
     </w:p>
     <w:p>
@@ -7337,20 +7345,102 @@
             </w:tcBorders>
             <w:vAlign w:val="center"/>
           </w:tcPr>
-          <w:p>
-            <w:pPr>
-              <w:spacing w:line="240" w:lineRule="auto" w:after="0"/>
+          <w:p xmlns:w="http://schemas.openxmlformats.org/wordprocessingml/2006/main">
+            <w:pPr>
+              <w:spacing w:before="60" w:after="60"/>
               <w:jc w:val="center"/>
             </w:pPr>
             <w:r>
               <w:rPr>
-                <w:i/>
-                <w:iCs/>
-                <w:color w:val="6B6462"/>
-                <w:sz w:val="21"/>
-                <w:szCs w:val="21"/>
-              </w:rPr>
-              <w:t xml:space="preserve">[Tempelkan screenshot hasil pengujian di sini]</w:t>
+                <w:noProof/>
+              </w:rPr>
+              <w:drawing xmlns:w="http://schemas.openxmlformats.org/wordprocessingml/2006/main" xmlns:wp="http://schemas.openxmlformats.org/drawingml/2006/wordprocessingDrawing" xmlns:r="http://schemas.openxmlformats.org/officeDocument/2006/relationships" xmlns:a="http://schemas.openxmlformats.org/drawingml/2006/main" xmlns:pic="http://schemas.openxmlformats.org/drawingml/2006/picture">
+                <wp:inline distT="0" distB="0" distL="0" distR="0">
+                  <wp:extent cx="5039995" cy="7343273"/>
+                  <wp:effectExtent l="0" t="0" r="0" b="0"/>
+                  <wp:docPr id="101" name="Picture 101"/>
+                  <wp:cNvGraphicFramePr>
+                    <a:graphicFrameLocks noChangeAspect="1"/>
+                  </wp:cNvGraphicFramePr>
+                  <a:graphic>
+                    <a:graphicData uri="http://schemas.openxmlformats.org/drawingml/2006/picture">
+                      <pic:pic>
+                        <pic:nvPicPr>
+                          <pic:cNvPr id="0" name="Picture 101"/>
+                          <pic:cNvPicPr>
+                            <a:picLocks noChangeAspect="1" noChangeArrowheads="1"/>
+                          </pic:cNvPicPr>
+                        </pic:nvPicPr>
+                        <pic:blipFill>
+                          <a:blip r:embed="rId101"/>
+                          <a:srcRect/>
+                          <a:stretch>
+                            <a:fillRect/>
+                          </a:stretch>
+                        </pic:blipFill>
+                        <pic:spPr>
+                          <a:xfrm>
+                            <a:off x="0" y="0"/>
+                            <a:ext cx="5039995" cy="7343273"/>
+                          </a:xfrm>
+                          <a:prstGeom prst="rect">
+                            <a:avLst/>
+                          </a:prstGeom>
+                        </pic:spPr>
+                      </pic:pic>
+                    </a:graphicData>
+                  </a:graphic>
+                </wp:inline>
+              </w:drawing>
+            </w:r>
+          </w:p>
+          <w:p xmlns:w="http://schemas.openxmlformats.org/wordprocessingml/2006/main">
+            <w:pPr>
+              <w:spacing w:before="60" w:after="60"/>
+              <w:jc w:val="center"/>
+            </w:pPr>
+            <w:r>
+              <w:rPr>
+                <w:noProof/>
+              </w:rPr>
+              <w:drawing xmlns:w="http://schemas.openxmlformats.org/wordprocessingml/2006/main" xmlns:wp="http://schemas.openxmlformats.org/drawingml/2006/wordprocessingDrawing" xmlns:r="http://schemas.openxmlformats.org/officeDocument/2006/relationships" xmlns:a="http://schemas.openxmlformats.org/drawingml/2006/main" xmlns:pic="http://schemas.openxmlformats.org/drawingml/2006/picture">
+                <wp:inline distT="0" distB="0" distL="0" distR="0">
+                  <wp:extent cx="5039995" cy="5579274"/>
+                  <wp:effectExtent l="0" t="0" r="0" b="0"/>
+                  <wp:docPr id="102" name="Picture 102"/>
+                  <wp:cNvGraphicFramePr>
+                    <a:graphicFrameLocks noChangeAspect="1"/>
+                  </wp:cNvGraphicFramePr>
+                  <a:graphic>
+                    <a:graphicData uri="http://schemas.openxmlformats.org/drawingml/2006/picture">
+                      <pic:pic>
+                        <pic:nvPicPr>
+                          <pic:cNvPr id="0" name="Picture 102"/>
+                          <pic:cNvPicPr>
+                            <a:picLocks noChangeAspect="1" noChangeArrowheads="1"/>
+                          </pic:cNvPicPr>
+                        </pic:nvPicPr>
+                        <pic:blipFill>
+                          <a:blip r:embed="rId102"/>
+                          <a:srcRect/>
+                          <a:stretch>
+                            <a:fillRect/>
+                          </a:stretch>
+                        </pic:blipFill>
+                        <pic:spPr>
+                          <a:xfrm>
+                            <a:off x="0" y="0"/>
+                            <a:ext cx="5039995" cy="5579274"/>
+                          </a:xfrm>
+                          <a:prstGeom prst="rect">
+                            <a:avLst/>
+                          </a:prstGeom>
+                        </pic:spPr>
+                      </pic:pic>
+                    </a:graphicData>
+                  </a:graphic>
+                </wp:inline>
+              </w:drawing>
             </w:r>
           </w:p>
         </w:tc>
@@ -7368,7 +7458,7 @@
           <w:sz w:val="20"/>
           <w:szCs w:val="20"/>
         </w:rPr>
-        <w:t xml:space="preserve">Gambar 1. Struktur project dan kode app.js</w:t>
+        <w:t xml:space="preserve">Gambar 1. Struktur project dan potongan kode app.js.</w:t>
       </w:r>
     </w:p>
     <w:tbl>
@@ -7406,20 +7496,53 @@
             </w:tcBorders>
             <w:vAlign w:val="center"/>
           </w:tcPr>
-          <w:p>
-            <w:pPr>
-              <w:spacing w:line="240" w:lineRule="auto" w:after="0"/>
+          <w:p xmlns:w="http://schemas.openxmlformats.org/wordprocessingml/2006/main">
+            <w:pPr>
+              <w:spacing w:before="60" w:after="60"/>
               <w:jc w:val="center"/>
             </w:pPr>
             <w:r>
               <w:rPr>
-                <w:i/>
-                <w:iCs/>
-                <w:color w:val="6B6462"/>
-                <w:sz w:val="21"/>
-                <w:szCs w:val="21"/>
-              </w:rPr>
-              <w:t xml:space="preserve">[Tempelkan screenshot hasil pengujian di sini]</w:t>
+                <w:noProof/>
+              </w:rPr>
+              <w:drawing xmlns:w="http://schemas.openxmlformats.org/wordprocessingml/2006/main" xmlns:wp="http://schemas.openxmlformats.org/drawingml/2006/wordprocessingDrawing" xmlns:r="http://schemas.openxmlformats.org/officeDocument/2006/relationships" xmlns:a="http://schemas.openxmlformats.org/drawingml/2006/main" xmlns:pic="http://schemas.openxmlformats.org/drawingml/2006/picture">
+                <wp:inline distT="0" distB="0" distL="0" distR="0">
+                  <wp:extent cx="5039995" cy="7343273"/>
+                  <wp:effectExtent l="0" t="0" r="0" b="0"/>
+                  <wp:docPr id="103" name="Picture 103"/>
+                  <wp:cNvGraphicFramePr>
+                    <a:graphicFrameLocks noChangeAspect="1"/>
+                  </wp:cNvGraphicFramePr>
+                  <a:graphic>
+                    <a:graphicData uri="http://schemas.openxmlformats.org/drawingml/2006/picture">
+                      <pic:pic>
+                        <pic:nvPicPr>
+                          <pic:cNvPr id="0" name="Picture 103"/>
+                          <pic:cNvPicPr>
+                            <a:picLocks noChangeAspect="1" noChangeArrowheads="1"/>
+                          </pic:cNvPicPr>
+                        </pic:nvPicPr>
+                        <pic:blipFill>
+                          <a:blip r:embed="rId103"/>
+                          <a:srcRect/>
+                          <a:stretch>
+                            <a:fillRect/>
+                          </a:stretch>
+                        </pic:blipFill>
+                        <pic:spPr>
+                          <a:xfrm>
+                            <a:off x="0" y="0"/>
+                            <a:ext cx="5039995" cy="7343273"/>
+                          </a:xfrm>
+                          <a:prstGeom prst="rect">
+                            <a:avLst/>
+                          </a:prstGeom>
+                        </pic:spPr>
+                      </pic:pic>
+                    </a:graphicData>
+                  </a:graphic>
+                </wp:inline>
+              </w:drawing>
             </w:r>
           </w:p>
         </w:tc>
@@ -7437,7 +7560,519 @@
           <w:sz w:val="20"/>
           <w:szCs w:val="20"/>
         </w:rPr>
-        <w:t xml:space="preserve">Gambar 2. Pengujian endpoint pada Postman/Thunder Client</w:t>
+        <w:t xml:space="preserve">Gambar 2. Pengujian endpoint pada deployment Vercel memakai curl (bagian 1 dari 5).</w:t>
+      </w:r>
+    </w:p>
+    <w:p xmlns:w="http://schemas.openxmlformats.org/wordprocessingml/2006/main">
+      <w:pPr>
+        <w:spacing w:before="60" w:after="60"/>
+        <w:jc w:val="center"/>
+      </w:pPr>
+      <w:r>
+        <w:rPr>
+          <w:noProof/>
+        </w:rPr>
+        <w:drawing xmlns:w="http://schemas.openxmlformats.org/wordprocessingml/2006/main" xmlns:wp="http://schemas.openxmlformats.org/drawingml/2006/wordprocessingDrawing" xmlns:r="http://schemas.openxmlformats.org/officeDocument/2006/relationships" xmlns:a="http://schemas.openxmlformats.org/drawingml/2006/main" xmlns:pic="http://schemas.openxmlformats.org/drawingml/2006/picture">
+          <wp:inline distT="0" distB="0" distL="0" distR="0">
+            <wp:extent cx="5039995" cy="7343273"/>
+            <wp:effectExtent l="0" t="0" r="0" b="0"/>
+            <wp:docPr id="104" name="Picture 104"/>
+            <wp:cNvGraphicFramePr>
+              <a:graphicFrameLocks noChangeAspect="1"/>
+            </wp:cNvGraphicFramePr>
+            <a:graphic>
+              <a:graphicData uri="http://schemas.openxmlformats.org/drawingml/2006/picture">
+                <pic:pic>
+                  <pic:nvPicPr>
+                    <pic:cNvPr id="0" name="Picture 104"/>
+                    <pic:cNvPicPr>
+                      <a:picLocks noChangeAspect="1" noChangeArrowheads="1"/>
+                    </pic:cNvPicPr>
+                  </pic:nvPicPr>
+                  <pic:blipFill>
+                    <a:blip r:embed="rId104"/>
+                    <a:srcRect/>
+                    <a:stretch>
+                      <a:fillRect/>
+                    </a:stretch>
+                  </pic:blipFill>
+                  <pic:spPr>
+                    <a:xfrm>
+                      <a:off x="0" y="0"/>
+                      <a:ext cx="5039995" cy="7343273"/>
+                    </a:xfrm>
+                    <a:prstGeom prst="rect">
+                      <a:avLst/>
+                    </a:prstGeom>
+                  </pic:spPr>
+                </pic:pic>
+              </a:graphicData>
+            </a:graphic>
+          </wp:inline>
+        </w:drawing>
+      </w:r>
+    </w:p>
+    <w:p xmlns:w="http://schemas.openxmlformats.org/wordprocessingml/2006/main">
+      <w:pPr>
+        <w:spacing w:before="100" w:after="300"/>
+        <w:jc w:val="center"/>
+      </w:pPr>
+      <w:r>
+        <w:rPr>
+          <w:i/>
+          <w:iCs/>
+          <w:sz w:val="20"/>
+          <w:szCs w:val="20"/>
+        </w:rPr>
+        <w:t xml:space="preserve">Gambar 3. Pengujian endpoint pada deployment Vercel memakai curl (bagian 2 dari 5).</w:t>
+      </w:r>
+    </w:p>
+    <w:p xmlns:w="http://schemas.openxmlformats.org/wordprocessingml/2006/main">
+      <w:pPr>
+        <w:spacing w:before="60" w:after="60"/>
+        <w:jc w:val="center"/>
+      </w:pPr>
+      <w:r>
+        <w:rPr>
+          <w:noProof/>
+        </w:rPr>
+        <w:drawing xmlns:w="http://schemas.openxmlformats.org/wordprocessingml/2006/main" xmlns:wp="http://schemas.openxmlformats.org/drawingml/2006/wordprocessingDrawing" xmlns:r="http://schemas.openxmlformats.org/officeDocument/2006/relationships" xmlns:a="http://schemas.openxmlformats.org/drawingml/2006/main" xmlns:pic="http://schemas.openxmlformats.org/drawingml/2006/picture">
+          <wp:inline distT="0" distB="0" distL="0" distR="0">
+            <wp:extent cx="5039995" cy="7343273"/>
+            <wp:effectExtent l="0" t="0" r="0" b="0"/>
+            <wp:docPr id="105" name="Picture 105"/>
+            <wp:cNvGraphicFramePr>
+              <a:graphicFrameLocks noChangeAspect="1"/>
+            </wp:cNvGraphicFramePr>
+            <a:graphic>
+              <a:graphicData uri="http://schemas.openxmlformats.org/drawingml/2006/picture">
+                <pic:pic>
+                  <pic:nvPicPr>
+                    <pic:cNvPr id="0" name="Picture 105"/>
+                    <pic:cNvPicPr>
+                      <a:picLocks noChangeAspect="1" noChangeArrowheads="1"/>
+                    </pic:cNvPicPr>
+                  </pic:nvPicPr>
+                  <pic:blipFill>
+                    <a:blip r:embed="rId105"/>
+                    <a:srcRect/>
+                    <a:stretch>
+                      <a:fillRect/>
+                    </a:stretch>
+                  </pic:blipFill>
+                  <pic:spPr>
+                    <a:xfrm>
+                      <a:off x="0" y="0"/>
+                      <a:ext cx="5039995" cy="7343273"/>
+                    </a:xfrm>
+                    <a:prstGeom prst="rect">
+                      <a:avLst/>
+                    </a:prstGeom>
+                  </pic:spPr>
+                </pic:pic>
+              </a:graphicData>
+            </a:graphic>
+          </wp:inline>
+        </w:drawing>
+      </w:r>
+    </w:p>
+    <w:p xmlns:w="http://schemas.openxmlformats.org/wordprocessingml/2006/main">
+      <w:pPr>
+        <w:spacing w:before="100" w:after="300"/>
+        <w:jc w:val="center"/>
+      </w:pPr>
+      <w:r>
+        <w:rPr>
+          <w:i/>
+          <w:iCs/>
+          <w:sz w:val="20"/>
+          <w:szCs w:val="20"/>
+        </w:rPr>
+        <w:t xml:space="preserve">Gambar 4. Pengujian endpoint pada deployment Vercel memakai curl (bagian 3 dari 5).</w:t>
+      </w:r>
+    </w:p>
+    <w:p xmlns:w="http://schemas.openxmlformats.org/wordprocessingml/2006/main">
+      <w:pPr>
+        <w:spacing w:before="60" w:after="60"/>
+        <w:jc w:val="center"/>
+      </w:pPr>
+      <w:r>
+        <w:rPr>
+          <w:noProof/>
+        </w:rPr>
+        <w:drawing xmlns:w="http://schemas.openxmlformats.org/wordprocessingml/2006/main" xmlns:wp="http://schemas.openxmlformats.org/drawingml/2006/wordprocessingDrawing" xmlns:r="http://schemas.openxmlformats.org/officeDocument/2006/relationships" xmlns:a="http://schemas.openxmlformats.org/drawingml/2006/main" xmlns:pic="http://schemas.openxmlformats.org/drawingml/2006/picture">
+          <wp:inline distT="0" distB="0" distL="0" distR="0">
+            <wp:extent cx="5039995" cy="7343273"/>
+            <wp:effectExtent l="0" t="0" r="0" b="0"/>
+            <wp:docPr id="106" name="Picture 106"/>
+            <wp:cNvGraphicFramePr>
+              <a:graphicFrameLocks noChangeAspect="1"/>
+            </wp:cNvGraphicFramePr>
+            <a:graphic>
+              <a:graphicData uri="http://schemas.openxmlformats.org/drawingml/2006/picture">
+                <pic:pic>
+                  <pic:nvPicPr>
+                    <pic:cNvPr id="0" name="Picture 106"/>
+                    <pic:cNvPicPr>
+                      <a:picLocks noChangeAspect="1" noChangeArrowheads="1"/>
+                    </pic:cNvPicPr>
+                  </pic:nvPicPr>
+                  <pic:blipFill>
+                    <a:blip r:embed="rId106"/>
+                    <a:srcRect/>
+                    <a:stretch>
+                      <a:fillRect/>
+                    </a:stretch>
+                  </pic:blipFill>
+                  <pic:spPr>
+                    <a:xfrm>
+                      <a:off x="0" y="0"/>
+                      <a:ext cx="5039995" cy="7343273"/>
+                    </a:xfrm>
+                    <a:prstGeom prst="rect">
+                      <a:avLst/>
+                    </a:prstGeom>
+                  </pic:spPr>
+                </pic:pic>
+              </a:graphicData>
+            </a:graphic>
+          </wp:inline>
+        </w:drawing>
+      </w:r>
+    </w:p>
+    <w:p xmlns:w="http://schemas.openxmlformats.org/wordprocessingml/2006/main">
+      <w:pPr>
+        <w:spacing w:before="100" w:after="300"/>
+        <w:jc w:val="center"/>
+      </w:pPr>
+      <w:r>
+        <w:rPr>
+          <w:i/>
+          <w:iCs/>
+          <w:sz w:val="20"/>
+          <w:szCs w:val="20"/>
+        </w:rPr>
+        <w:t xml:space="preserve">Gambar 5. Pengujian endpoint pada deployment Vercel memakai curl (bagian 4 dari 5).</w:t>
+      </w:r>
+    </w:p>
+    <w:p xmlns:w="http://schemas.openxmlformats.org/wordprocessingml/2006/main">
+      <w:pPr>
+        <w:spacing w:before="60" w:after="60"/>
+        <w:jc w:val="center"/>
+      </w:pPr>
+      <w:r>
+        <w:rPr>
+          <w:noProof/>
+        </w:rPr>
+        <w:drawing xmlns:w="http://schemas.openxmlformats.org/wordprocessingml/2006/main" xmlns:wp="http://schemas.openxmlformats.org/drawingml/2006/wordprocessingDrawing" xmlns:r="http://schemas.openxmlformats.org/officeDocument/2006/relationships" xmlns:a="http://schemas.openxmlformats.org/drawingml/2006/main" xmlns:pic="http://schemas.openxmlformats.org/drawingml/2006/picture">
+          <wp:inline distT="0" distB="0" distL="0" distR="0">
+            <wp:extent cx="5039995" cy="2303278"/>
+            <wp:effectExtent l="0" t="0" r="0" b="0"/>
+            <wp:docPr id="107" name="Picture 107"/>
+            <wp:cNvGraphicFramePr>
+              <a:graphicFrameLocks noChangeAspect="1"/>
+            </wp:cNvGraphicFramePr>
+            <a:graphic>
+              <a:graphicData uri="http://schemas.openxmlformats.org/drawingml/2006/picture">
+                <pic:pic>
+                  <pic:nvPicPr>
+                    <pic:cNvPr id="0" name="Picture 107"/>
+                    <pic:cNvPicPr>
+                      <a:picLocks noChangeAspect="1" noChangeArrowheads="1"/>
+                    </pic:cNvPicPr>
+                  </pic:nvPicPr>
+                  <pic:blipFill>
+                    <a:blip r:embed="rId107"/>
+                    <a:srcRect/>
+                    <a:stretch>
+                      <a:fillRect/>
+                    </a:stretch>
+                  </pic:blipFill>
+                  <pic:spPr>
+                    <a:xfrm>
+                      <a:off x="0" y="0"/>
+                      <a:ext cx="5039995" cy="2303278"/>
+                    </a:xfrm>
+                    <a:prstGeom prst="rect">
+                      <a:avLst/>
+                    </a:prstGeom>
+                  </pic:spPr>
+                </pic:pic>
+              </a:graphicData>
+            </a:graphic>
+          </wp:inline>
+        </w:drawing>
+      </w:r>
+    </w:p>
+    <w:p xmlns:w="http://schemas.openxmlformats.org/wordprocessingml/2006/main">
+      <w:pPr>
+        <w:spacing w:before="100" w:after="300"/>
+        <w:jc w:val="center"/>
+      </w:pPr>
+      <w:r>
+        <w:rPr>
+          <w:i/>
+          <w:iCs/>
+          <w:sz w:val="20"/>
+          <w:szCs w:val="20"/>
+        </w:rPr>
+        <w:t xml:space="preserve">Gambar 6. Pengujian endpoint pada deployment Vercel memakai curl (bagian 5 dari 5).</w:t>
+      </w:r>
+    </w:p>
+    <w:p xmlns:w="http://schemas.openxmlformats.org/wordprocessingml/2006/main">
+      <w:pPr>
+        <w:spacing w:before="60" w:after="60"/>
+        <w:jc w:val="center"/>
+      </w:pPr>
+      <w:r>
+        <w:rPr>
+          <w:noProof/>
+        </w:rPr>
+        <w:drawing xmlns:w="http://schemas.openxmlformats.org/wordprocessingml/2006/main" xmlns:wp="http://schemas.openxmlformats.org/drawingml/2006/wordprocessingDrawing" xmlns:r="http://schemas.openxmlformats.org/officeDocument/2006/relationships" xmlns:a="http://schemas.openxmlformats.org/drawingml/2006/main" xmlns:pic="http://schemas.openxmlformats.org/drawingml/2006/picture">
+          <wp:inline distT="0" distB="0" distL="0" distR="0">
+            <wp:extent cx="5039995" cy="7343273"/>
+            <wp:effectExtent l="0" t="0" r="0" b="0"/>
+            <wp:docPr id="108" name="Picture 108"/>
+            <wp:cNvGraphicFramePr>
+              <a:graphicFrameLocks noChangeAspect="1"/>
+            </wp:cNvGraphicFramePr>
+            <a:graphic>
+              <a:graphicData uri="http://schemas.openxmlformats.org/drawingml/2006/picture">
+                <pic:pic>
+                  <pic:nvPicPr>
+                    <pic:cNvPr id="0" name="Picture 108"/>
+                    <pic:cNvPicPr>
+                      <a:picLocks noChangeAspect="1" noChangeArrowheads="1"/>
+                    </pic:cNvPicPr>
+                  </pic:nvPicPr>
+                  <pic:blipFill>
+                    <a:blip r:embed="rId108"/>
+                    <a:srcRect/>
+                    <a:stretch>
+                      <a:fillRect/>
+                    </a:stretch>
+                  </pic:blipFill>
+                  <pic:spPr>
+                    <a:xfrm>
+                      <a:off x="0" y="0"/>
+                      <a:ext cx="5039995" cy="7343273"/>
+                    </a:xfrm>
+                    <a:prstGeom prst="rect">
+                      <a:avLst/>
+                    </a:prstGeom>
+                  </pic:spPr>
+                </pic:pic>
+              </a:graphicData>
+            </a:graphic>
+          </wp:inline>
+        </w:drawing>
+      </w:r>
+    </w:p>
+    <w:p xmlns:w="http://schemas.openxmlformats.org/wordprocessingml/2006/main">
+      <w:pPr>
+        <w:spacing w:before="100" w:after="300"/>
+        <w:jc w:val="center"/>
+      </w:pPr>
+      <w:r>
+        <w:rPr>
+          <w:i/>
+          <w:iCs/>
+          <w:sz w:val="20"/>
+          <w:szCs w:val="20"/>
+        </w:rPr>
+        <w:t xml:space="preserve">Gambar 7. Pengujian endpoint pada server lokal http://localhost:3000 memakai curl (bagian 1 dari 4).</w:t>
+      </w:r>
+    </w:p>
+    <w:p xmlns:w="http://schemas.openxmlformats.org/wordprocessingml/2006/main">
+      <w:pPr>
+        <w:spacing w:before="60" w:after="60"/>
+        <w:jc w:val="center"/>
+      </w:pPr>
+      <w:r>
+        <w:rPr>
+          <w:noProof/>
+        </w:rPr>
+        <w:drawing xmlns:w="http://schemas.openxmlformats.org/wordprocessingml/2006/main" xmlns:wp="http://schemas.openxmlformats.org/drawingml/2006/wordprocessingDrawing" xmlns:r="http://schemas.openxmlformats.org/officeDocument/2006/relationships" xmlns:a="http://schemas.openxmlformats.org/drawingml/2006/main" xmlns:pic="http://schemas.openxmlformats.org/drawingml/2006/picture">
+          <wp:inline distT="0" distB="0" distL="0" distR="0">
+            <wp:extent cx="5039995" cy="7343273"/>
+            <wp:effectExtent l="0" t="0" r="0" b="0"/>
+            <wp:docPr id="109" name="Picture 109"/>
+            <wp:cNvGraphicFramePr>
+              <a:graphicFrameLocks noChangeAspect="1"/>
+            </wp:cNvGraphicFramePr>
+            <a:graphic>
+              <a:graphicData uri="http://schemas.openxmlformats.org/drawingml/2006/picture">
+                <pic:pic>
+                  <pic:nvPicPr>
+                    <pic:cNvPr id="0" name="Picture 109"/>
+                    <pic:cNvPicPr>
+                      <a:picLocks noChangeAspect="1" noChangeArrowheads="1"/>
+                    </pic:cNvPicPr>
+                  </pic:nvPicPr>
+                  <pic:blipFill>
+                    <a:blip r:embed="rId109"/>
+                    <a:srcRect/>
+                    <a:stretch>
+                      <a:fillRect/>
+                    </a:stretch>
+                  </pic:blipFill>
+                  <pic:spPr>
+                    <a:xfrm>
+                      <a:off x="0" y="0"/>
+                      <a:ext cx="5039995" cy="7343273"/>
+                    </a:xfrm>
+                    <a:prstGeom prst="rect">
+                      <a:avLst/>
+                    </a:prstGeom>
+                  </pic:spPr>
+                </pic:pic>
+              </a:graphicData>
+            </a:graphic>
+          </wp:inline>
+        </w:drawing>
+      </w:r>
+    </w:p>
+    <w:p xmlns:w="http://schemas.openxmlformats.org/wordprocessingml/2006/main">
+      <w:pPr>
+        <w:spacing w:before="100" w:after="300"/>
+        <w:jc w:val="center"/>
+      </w:pPr>
+      <w:r>
+        <w:rPr>
+          <w:i/>
+          <w:iCs/>
+          <w:sz w:val="20"/>
+          <w:szCs w:val="20"/>
+        </w:rPr>
+        <w:t xml:space="preserve">Gambar 8. Pengujian endpoint pada server lokal http://localhost:3000 memakai curl (bagian 2 dari 4).</w:t>
+      </w:r>
+    </w:p>
+    <w:p xmlns:w="http://schemas.openxmlformats.org/wordprocessingml/2006/main">
+      <w:pPr>
+        <w:spacing w:before="60" w:after="60"/>
+        <w:jc w:val="center"/>
+      </w:pPr>
+      <w:r>
+        <w:rPr>
+          <w:noProof/>
+        </w:rPr>
+        <w:drawing xmlns:w="http://schemas.openxmlformats.org/wordprocessingml/2006/main" xmlns:wp="http://schemas.openxmlformats.org/drawingml/2006/wordprocessingDrawing" xmlns:r="http://schemas.openxmlformats.org/officeDocument/2006/relationships" xmlns:a="http://schemas.openxmlformats.org/drawingml/2006/main" xmlns:pic="http://schemas.openxmlformats.org/drawingml/2006/picture">
+          <wp:inline distT="0" distB="0" distL="0" distR="0">
+            <wp:extent cx="5039995" cy="7343273"/>
+            <wp:effectExtent l="0" t="0" r="0" b="0"/>
+            <wp:docPr id="110" name="Picture 110"/>
+            <wp:cNvGraphicFramePr>
+              <a:graphicFrameLocks noChangeAspect="1"/>
+            </wp:cNvGraphicFramePr>
+            <a:graphic>
+              <a:graphicData uri="http://schemas.openxmlformats.org/drawingml/2006/picture">
+                <pic:pic>
+                  <pic:nvPicPr>
+                    <pic:cNvPr id="0" name="Picture 110"/>
+                    <pic:cNvPicPr>
+                      <a:picLocks noChangeAspect="1" noChangeArrowheads="1"/>
+                    </pic:cNvPicPr>
+                  </pic:nvPicPr>
+                  <pic:blipFill>
+                    <a:blip r:embed="rId110"/>
+                    <a:srcRect/>
+                    <a:stretch>
+                      <a:fillRect/>
+                    </a:stretch>
+                  </pic:blipFill>
+                  <pic:spPr>
+                    <a:xfrm>
+                      <a:off x="0" y="0"/>
+                      <a:ext cx="5039995" cy="7343273"/>
+                    </a:xfrm>
+                    <a:prstGeom prst="rect">
+                      <a:avLst/>
+                    </a:prstGeom>
+                  </pic:spPr>
+                </pic:pic>
+              </a:graphicData>
+            </a:graphic>
+          </wp:inline>
+        </w:drawing>
+      </w:r>
+    </w:p>
+    <w:p xmlns:w="http://schemas.openxmlformats.org/wordprocessingml/2006/main">
+      <w:pPr>
+        <w:spacing w:before="100" w:after="300"/>
+        <w:jc w:val="center"/>
+      </w:pPr>
+      <w:r>
+        <w:rPr>
+          <w:i/>
+          <w:iCs/>
+          <w:sz w:val="20"/>
+          <w:szCs w:val="20"/>
+        </w:rPr>
+        <w:t xml:space="preserve">Gambar 9. Pengujian endpoint pada server lokal http://localhost:3000 memakai curl (bagian 3 dari 4).</w:t>
+      </w:r>
+    </w:p>
+    <w:p xmlns:w="http://schemas.openxmlformats.org/wordprocessingml/2006/main">
+      <w:pPr>
+        <w:spacing w:before="60" w:after="60"/>
+        <w:jc w:val="center"/>
+      </w:pPr>
+      <w:r>
+        <w:rPr>
+          <w:noProof/>
+        </w:rPr>
+        <w:drawing xmlns:w="http://schemas.openxmlformats.org/wordprocessingml/2006/main" xmlns:wp="http://schemas.openxmlformats.org/drawingml/2006/wordprocessingDrawing" xmlns:r="http://schemas.openxmlformats.org/officeDocument/2006/relationships" xmlns:a="http://schemas.openxmlformats.org/drawingml/2006/main" xmlns:pic="http://schemas.openxmlformats.org/drawingml/2006/picture">
+          <wp:inline distT="0" distB="0" distL="0" distR="0">
+            <wp:extent cx="5039995" cy="3311277"/>
+            <wp:effectExtent l="0" t="0" r="0" b="0"/>
+            <wp:docPr id="111" name="Picture 111"/>
+            <wp:cNvGraphicFramePr>
+              <a:graphicFrameLocks noChangeAspect="1"/>
+            </wp:cNvGraphicFramePr>
+            <a:graphic>
+              <a:graphicData uri="http://schemas.openxmlformats.org/drawingml/2006/picture">
+                <pic:pic>
+                  <pic:nvPicPr>
+                    <pic:cNvPr id="0" name="Picture 111"/>
+                    <pic:cNvPicPr>
+                      <a:picLocks noChangeAspect="1" noChangeArrowheads="1"/>
+                    </pic:cNvPicPr>
+                  </pic:nvPicPr>
+                  <pic:blipFill>
+                    <a:blip r:embed="rId111"/>
+                    <a:srcRect/>
+                    <a:stretch>
+                      <a:fillRect/>
+                    </a:stretch>
+                  </pic:blipFill>
+                  <pic:spPr>
+                    <a:xfrm>
+                      <a:off x="0" y="0"/>
+                      <a:ext cx="5039995" cy="3311277"/>
+                    </a:xfrm>
+                    <a:prstGeom prst="rect">
+                      <a:avLst/>
+                    </a:prstGeom>
+                  </pic:spPr>
+                </pic:pic>
+              </a:graphicData>
+            </a:graphic>
+          </wp:inline>
+        </w:drawing>
+      </w:r>
+    </w:p>
+    <w:p xmlns:w="http://schemas.openxmlformats.org/wordprocessingml/2006/main">
+      <w:pPr>
+        <w:spacing w:before="100" w:after="300"/>
+        <w:jc w:val="center"/>
+      </w:pPr>
+      <w:r>
+        <w:rPr>
+          <w:i/>
+          <w:iCs/>
+          <w:sz w:val="20"/>
+          <w:szCs w:val="20"/>
+        </w:rPr>
+        <w:t xml:space="preserve">Gambar 10. Pengujian endpoint pada server lokal http://localhost:3000 memakai curl (bagian 4 dari 4).</w:t>
       </w:r>
     </w:p>
     <w:p>
@@ -7496,7 +8131,7 @@
         <w:spacing w:after="160"/>
       </w:pPr>
       <w:r>
-        <w:t xml:space="preserve">Data lukisan disimpan pada array di memori (in-memory), bukan pada basis data. Konsekuensinya seluruh perubahan dari POST, PUT, dan DELETE hanya bertahan selama proses server berjalan; ketika server di-restart, data kembali ke tiga lukisan awal dan penomoran nextId dimulai lagi dari 4. Cara ini memadai untuk praktikum RESTful API murni tanpa basis data, tetapi untuk kebutuhan produksi penyimpanan perlu diganti dengan basis data yang persisten. Penanda bahwa server siap menerima request adalah log "Server berjalan di http://localhost:3000" yang tampil setelah perintah npm run dev dijalankan.</w:t>
+        <w:t xml:space="preserve">Data lukisan disimpan pada array di memori (in-memory), bukan pada basis data. Konsekuensinya seluruh perubahan dari POST, PUT, dan DELETE hanya bertahan selama proses server berjalan; ketika server di-restart, data kembali ke tiga lukisan awal dan penomoran nextId dimulai lagi dari 4. Cara ini memadai untuk praktikum RESTful API murni tanpa basis data, tetapi untuk kebutuhan produksi penyimpanan perlu diganti dengan basis data yang persisten. Penanda bahwa server siap menerima request adalah log "Server berjalan di http://localhost:3000" yang tampil setelah perintah npm run dev dijalankan. Catatan ini berlaku juga pada Vercel: karena bersifat serverless, array data dapat kembali ke tiga lukisan awal setelah instance tidak aktif, sehingga setiap request diuji secara berdiri sendiri.</w:t>
       </w:r>
     </w:p>
     <w:p>
@@ -8094,7 +8729,7 @@
         <w:rPr>
           <w:lang w:val="sv-SE"/>
         </w:rPr>
-        <w:t xml:space="preserve">Tautan Deployment (jika ada): (isi setelah deploy ke Vercel)</w:t>
+        <w:t xml:space="preserve">Tautan Deployment (jika ada): https://tugas1-restful-2428240069.vercel.app</w:t>
       </w:r>
     </w:p>
     <w:sectPr>

</xml_diff>

<commit_message>
docs: samakan alat pengujian pada laporan dengan curl
</commit_message>
<xml_diff>
--- a/Laporan_Tugas1_2428240069_M Rizki Algipari.docx
+++ b/Laporan_Tugas1_2428240069_M Rizki Algipari.docx
@@ -1712,7 +1712,7 @@
                 <w:sz w:val="21"/>
                 <w:szCs w:val="21"/>
               </w:rPr>
-              <w:t xml:space="preserve">Postman / Thunder Client</w:t>
+              <w:t xml:space="preserve">curl dan terminal Git Bash</w:t>
             </w:r>
           </w:p>
         </w:tc>
@@ -1736,7 +1736,7 @@
                 <w:sz w:val="21"/>
                 <w:szCs w:val="21"/>
               </w:rPr>
-              <w:t xml:space="preserve">Versi terbaru (klien pengujian endpoint API)</w:t>
+              <w:t xml:space="preserve">curl 8.21.0 (klien pengujian endpoint API dari terminal)</w:t>
             </w:r>
           </w:p>
         </w:tc>

</xml_diff>